<commit_message>
Izmene u arhitekturnom projektu
</commit_message>
<xml_diff>
--- a/Dokumentacija/D05_Arh_Projekat.docx
+++ b/Dokumentacija/D05_Arh_Projekat.docx
@@ -11,6 +11,9 @@
         </w:tabs>
         <w:jc w:val="right"/>
       </w:pPr>
+      <w:r>
+        <w:t>-</w:t>
+      </w:r>
       <w:r>
         <w:t>Qosh</w:t>
       </w:r>
@@ -1395,7 +1398,7 @@
         <w:rPr>
           <w:noProof/>
         </w:rPr>
-        <w:t>8</w:t>
+        <w:t>7</w:t>
       </w:r>
       <w:r>
         <w:rPr>
@@ -3410,7 +3413,19 @@
         <w:rPr>
           <w:noProof/>
         </w:rPr>
-        <w:t>Pregled arhitekture – organizacija paketa i podsistema u slojeve</w:t>
+        <w:t xml:space="preserve">Pregled arhitekture </w:t>
+      </w:r>
+      <w:r>
+        <w:rPr>
+          <w:noProof/>
+        </w:rPr>
+        <w:t>-</w:t>
+      </w:r>
+      <w:r>
+        <w:rPr>
+          <w:noProof/>
+        </w:rPr>
+        <w:t xml:space="preserve"> organizacija paketa i podsistema u slojeve</w:t>
       </w:r>
       <w:r>
         <w:rPr>
@@ -3773,7 +3788,7 @@
         <w:rPr>
           <w:noProof/>
         </w:rPr>
-        <w:t>12</w:t>
+        <w:t>11</w:t>
       </w:r>
       <w:r>
         <w:rPr>
@@ -3855,7 +3870,7 @@
         <w:rPr>
           <w:noProof/>
         </w:rPr>
-        <w:t>12</w:t>
+        <w:t>11</w:t>
       </w:r>
       <w:r>
         <w:rPr>
@@ -4184,7 +4199,7 @@
         <w:rPr>
           <w:noProof/>
         </w:rPr>
-        <w:t>13</w:t>
+        <w:t>12</w:t>
       </w:r>
       <w:r>
         <w:rPr>
@@ -4594,7 +4609,7 @@
         <w:rPr>
           <w:noProof/>
         </w:rPr>
-        <w:t>14</w:t>
+        <w:t>13</w:t>
       </w:r>
       <w:r>
         <w:rPr>
@@ -4676,7 +4691,7 @@
         <w:rPr>
           <w:noProof/>
         </w:rPr>
-        <w:t>14</w:t>
+        <w:t>13</w:t>
       </w:r>
       <w:r>
         <w:rPr>
@@ -5605,7 +5620,13 @@
         <w:t xml:space="preserve">-a. </w:t>
       </w:r>
       <w:r>
-        <w:t>Namena sistema je efikasno upravljanje sportskim događajima – ligama i turnirima</w:t>
+        <w:t xml:space="preserve">Namena sistema je efikasno upravljanje sportskim događajima </w:t>
+      </w:r>
+      <w:r>
+        <w:t>-</w:t>
+      </w:r>
+      <w:r>
+        <w:t xml:space="preserve"> ligama i turnirima</w:t>
       </w:r>
       <w:r>
         <w:t>.</w:t>
@@ -5650,7 +5671,13 @@
         <w:t>Qosh</w:t>
       </w:r>
       <w:r>
-        <w:t xml:space="preserve"> – Predlog projekta, V1.0, </w:t>
+        <w:t xml:space="preserve"> </w:t>
+      </w:r>
+      <w:r>
+        <w:t>-</w:t>
+      </w:r>
+      <w:r>
+        <w:t xml:space="preserve"> Predlog projekta, V1.0, </w:t>
       </w:r>
       <w:r>
         <w:t>2026</w:t>
@@ -5682,7 +5709,13 @@
         <w:t>Qosh</w:t>
       </w:r>
       <w:r>
-        <w:t xml:space="preserve"> – Planirani raspored aktivnosti na projektu, V1.0, </w:t>
+        <w:t xml:space="preserve"> </w:t>
+      </w:r>
+      <w:r>
+        <w:t>-</w:t>
+      </w:r>
+      <w:r>
+        <w:t xml:space="preserve"> Planirani raspored aktivnosti na projektu, V1.0, </w:t>
       </w:r>
       <w:r>
         <w:t>2026</w:t>
@@ -5714,7 +5747,13 @@
         <w:t>Qosh</w:t>
       </w:r>
       <w:r>
-        <w:t xml:space="preserve"> – Plan realizacije projekta, V1.0, </w:t>
+        <w:t xml:space="preserve"> </w:t>
+      </w:r>
+      <w:r>
+        <w:t>-</w:t>
+      </w:r>
+      <w:r>
+        <w:t xml:space="preserve"> Plan realizacije projekta, V1.0, </w:t>
       </w:r>
       <w:r>
         <w:t>2026</w:t>
@@ -5746,7 +5785,13 @@
         <w:t>Qosh</w:t>
       </w:r>
       <w:r>
-        <w:t xml:space="preserve"> – Vizija sistema, V1.0, </w:t>
+        <w:t xml:space="preserve"> </w:t>
+      </w:r>
+      <w:r>
+        <w:t>-</w:t>
+      </w:r>
+      <w:r>
+        <w:t xml:space="preserve"> Vizija sistema, V1.0, </w:t>
       </w:r>
       <w:r>
         <w:t>2026</w:t>
@@ -5778,7 +5823,13 @@
         <w:t>Qosh</w:t>
       </w:r>
       <w:r>
-        <w:t xml:space="preserve"> – Specifikacija zahteva, V1.0, </w:t>
+        <w:t xml:space="preserve"> </w:t>
+      </w:r>
+      <w:r>
+        <w:t>-</w:t>
+      </w:r>
+      <w:r>
+        <w:t xml:space="preserve"> Specifikacija zahteva, V1.0, </w:t>
       </w:r>
       <w:r>
         <w:t>2026</w:t>
@@ -7836,7 +7887,10 @@
         <w:t xml:space="preserve">Pregled arhitekture </w:t>
       </w:r>
       <w:r>
-        <w:t xml:space="preserve">– </w:t>
+        <w:t>-</w:t>
+      </w:r>
+      <w:r>
+        <w:t xml:space="preserve"> </w:t>
       </w:r>
       <w:r>
         <w:t>organizacija paketa i podsistema u slojeve</w:t>
@@ -8673,7 +8727,13 @@
         <w:ind w:left="709"/>
       </w:pPr>
       <w:r>
-        <w:t>DBMS (Database Management System) server je namenski računar na kome se izvršava Microsoft SQL Server (MSSQL) – sistem za upravljanje relacionim bazama podataka koji se prirodno i podrazumevano integriše sa .NET okruženjem kroz Entity Framework Core. Unutar ove baze trajno se skladište svi podaci o korisnicima, ligama, rosterima timova, poslatih pozivnica i kompletnoj istoriji košarkaške statistike. Zbog bezbednosti samih podataka i sprečavanja neovlašćenih spoljnih manipulacija, pristup DBMS serveru je strogo konfigurisan i ograničen samo na zahteve koji dolaze sa Web servera unutar lokalne mreže (LAN) kroz zaštićeni port</w:t>
+        <w:t xml:space="preserve">DBMS (Database Management System) server je namenski računar na kome se izvršava Microsoft SQL Server (MSSQL) </w:t>
+      </w:r>
+      <w:r>
+        <w:t>-</w:t>
+      </w:r>
+      <w:r>
+        <w:t xml:space="preserve"> sistem za upravljanje relacionim bazama podataka koji se prirodno i podrazumevano integriše sa .NET okruženjem kroz Entity Framework Core. Unutar ove baze trajno se skladište svi podaci o korisnicima, ligama, rosterima timova, poslatih pozivnica i kompletnoj istoriji košarkaške statistike. Zbog bezbednosti samih podataka i sprečavanja neovlašćenih spoljnih manipulacija, pristup DBMS serveru je strogo konfigurisan i ograničen samo na zahteve koji dolaze sa Web servera unutar lokalne mreže (LAN) kroz zaštićeni port</w:t>
       </w:r>
       <w:r>
         <w:t>.</w:t>
@@ -9015,14 +9075,7 @@
         <w:ind w:left="1440"/>
       </w:pPr>
       <w:r>
-        <w:rPr>
-          <w:b/>
-          <w:bCs/>
-        </w:rPr>
-        <w:t>LandingPage.tsx</w:t>
-      </w:r>
-      <w:r>
-        <w:t xml:space="preserve"> - javna početna stranica </w:t>
+        <w:t xml:space="preserve">LandingPage.tsx - javna početna stranica </w:t>
       </w:r>
       <w:r>
         <w:t>web aplikacije</w:t>
@@ -9044,20 +9097,7 @@
         <w:ind w:left="1440"/>
       </w:pPr>
       <w:r>
-        <w:rPr>
-          <w:b/>
-          <w:bCs/>
-        </w:rPr>
-        <w:t>LoginPage.tsx</w:t>
-      </w:r>
-      <w:r>
-        <w:t xml:space="preserve"> - ekran koji služi za autentifikaciju, registraciju i validaciju korisničkih kredencijala pre ulaska u </w:t>
-      </w:r>
-      <w:r>
-        <w:t>sistem</w:t>
-      </w:r>
-      <w:r>
-        <w:t>.</w:t>
+        <w:t>LoginPage.tsx - ekran koji služi za autentifikaciju, registraciju i validaciju korisničkih kredencijala pre ulaska u sistem.</w:t>
       </w:r>
     </w:p>
     <w:p>
@@ -9073,14 +9113,7 @@
         <w:ind w:left="1440"/>
       </w:pPr>
       <w:r>
-        <w:rPr>
-          <w:b/>
-          <w:bCs/>
-        </w:rPr>
-        <w:t>LeaguesPage.tsx</w:t>
-      </w:r>
-      <w:r>
-        <w:t xml:space="preserve"> - modul za pretragu, filtriranje formata, pregled liga i prikaz kompletnog kostura takmičenja (bracket-a).</w:t>
+        <w:t>LeaguesPage.tsx - modul za pretragu, filtriranje formata, pregled liga i prikaz kompletnog kostura takmičenja (bracket-a).</w:t>
       </w:r>
     </w:p>
     <w:p>
@@ -9096,14 +9129,7 @@
         <w:ind w:left="1440"/>
       </w:pPr>
       <w:r>
-        <w:rPr>
-          <w:b/>
-          <w:bCs/>
-        </w:rPr>
-        <w:t>MatchDetails.tsx</w:t>
-      </w:r>
-      <w:r>
-        <w:t xml:space="preserve"> - stranica za detaljan pregled statistike, poena, četvrtina i zvaničnog digitalnog zapisnika pojedinačne utakmice.</w:t>
+        <w:t>MatchDetails.tsx - stranica za detaljan pregled statistike, poena, četvrtina i zvaničnog digitalnog zapisnika pojedinačne utakmice.</w:t>
       </w:r>
     </w:p>
     <w:p>
@@ -9119,14 +9145,7 @@
         <w:ind w:left="1440"/>
       </w:pPr>
       <w:r>
-        <w:rPr>
-          <w:b/>
-          <w:bCs/>
-        </w:rPr>
-        <w:t>TeamProfilePage.tsx</w:t>
-      </w:r>
-      <w:r>
-        <w:t xml:space="preserve"> - interfejs za pregled rostera i timske statistike, sa namenskim opcijama za upravljanje timom od strane Kapitena.</w:t>
+        <w:t>TeamProfilePage.tsx - interfejs za pregled rostera i timske statistike, sa namenskim opcijama za upravljanje timom od strane Kapitena.</w:t>
       </w:r>
     </w:p>
     <w:p>
@@ -9142,14 +9161,7 @@
         <w:ind w:left="1440"/>
       </w:pPr>
       <w:r>
-        <w:rPr>
-          <w:b/>
-          <w:bCs/>
-        </w:rPr>
-        <w:t>UserInvitesPage.tsx</w:t>
-      </w:r>
-      <w:r>
-        <w:t xml:space="preserve"> - komponenta namenjena za upravljanje, slanje i prihvatanje/odbijanje pozivnica za priključivanje timu.</w:t>
+        <w:t>UserInvitesPage.tsx - komponenta namenjena za upravljanje, slanje i prihvatanje/odbijanje pozivnica za priključivanje timu.</w:t>
       </w:r>
     </w:p>
     <w:p>
@@ -9165,14 +9177,7 @@
         <w:ind w:left="1440"/>
       </w:pPr>
       <w:r>
-        <w:rPr>
-          <w:b/>
-          <w:bCs/>
-        </w:rPr>
-        <w:t>AdminDashboard.tsx</w:t>
-      </w:r>
-      <w:r>
-        <w:t xml:space="preserve"> - kontrolni panel namenjen Administratoru i Organizatoru za upravljanje korisničkim ulogama, odobravanje prijava timova i kreiranje turnira.</w:t>
+        <w:t>AdminDashboard.tsx - kontrolni panel namenjen Administratoru i Organizatoru za upravljanje korisničkim ulogama, odobravanje prijava timova i kreiranje turnira.</w:t>
       </w:r>
     </w:p>
     <w:p>
@@ -9287,16 +9292,8 @@
           <w:ilvl w:val="0"/>
           <w:numId w:val="40"/>
         </w:numPr>
-        <w:rPr>
-          <w:b/>
-          <w:bCs/>
-        </w:rPr>
-      </w:pPr>
-      <w:r>
-        <w:rPr>
-          <w:b/>
-          <w:bCs/>
-        </w:rPr>
+      </w:pPr>
+      <w:r>
         <w:t>AuthController</w:t>
       </w:r>
     </w:p>
@@ -9313,16 +9310,8 @@
       <w:pPr>
         <w:pStyle w:val="ListParagraph"/>
         <w:widowControl/>
-        <w:rPr>
-          <w:b/>
-          <w:bCs/>
-        </w:rPr>
-      </w:pPr>
-      <w:r>
-        <w:rPr>
-          <w:b/>
-          <w:bCs/>
-        </w:rPr>
+      </w:pPr>
+      <w:r>
         <w:t>Metode:</w:t>
       </w:r>
     </w:p>
@@ -9351,7 +9340,21 @@
           <w:sz w:val="20"/>
           <w:szCs w:val="20"/>
         </w:rPr>
-        <w:t xml:space="preserve"> – Vrši registraciju novih korisnika</w:t>
+        <w:t xml:space="preserve"> </w:t>
+      </w:r>
+      <w:r>
+        <w:rPr>
+          <w:sz w:val="20"/>
+          <w:szCs w:val="20"/>
+        </w:rPr>
+        <w:t>-</w:t>
+      </w:r>
+      <w:r>
+        <w:rPr>
+          <w:sz w:val="20"/>
+          <w:szCs w:val="20"/>
+        </w:rPr>
+        <w:t xml:space="preserve"> Vrši registraciju novih korisnika</w:t>
       </w:r>
       <w:r>
         <w:rPr>
@@ -9425,7 +9428,21 @@
           <w:sz w:val="20"/>
           <w:szCs w:val="20"/>
         </w:rPr>
-        <w:t xml:space="preserve"> – Autentifikuje korisnika proverom kredencijala i generiše kriptografski potpisan JWT token koji klijent koristi za autorizaciju.</w:t>
+        <w:t xml:space="preserve"> </w:t>
+      </w:r>
+      <w:r>
+        <w:rPr>
+          <w:sz w:val="20"/>
+          <w:szCs w:val="20"/>
+        </w:rPr>
+        <w:t>-</w:t>
+      </w:r>
+      <w:r>
+        <w:rPr>
+          <w:sz w:val="20"/>
+          <w:szCs w:val="20"/>
+        </w:rPr>
+        <w:t xml:space="preserve"> Autentifikuje korisnika proverom kredencijala i generiše kriptografski potpisan JWT token koji klijent koristi za autorizaciju.</w:t>
       </w:r>
     </w:p>
     <w:p>
@@ -9452,7 +9469,21 @@
           <w:sz w:val="20"/>
           <w:szCs w:val="20"/>
         </w:rPr>
-        <w:t xml:space="preserve"> – Obavlja bezbednu odjavu korisnika sa sistema, prekida aktivnu sesiju i opciono invalidira token na strani servera.</w:t>
+        <w:t xml:space="preserve"> </w:t>
+      </w:r>
+      <w:r>
+        <w:rPr>
+          <w:sz w:val="20"/>
+          <w:szCs w:val="20"/>
+        </w:rPr>
+        <w:t>-</w:t>
+      </w:r>
+      <w:r>
+        <w:rPr>
+          <w:sz w:val="20"/>
+          <w:szCs w:val="20"/>
+        </w:rPr>
+        <w:t xml:space="preserve"> Obavlja bezbednu odjavu korisnika sa sistema, prekida aktivnu sesiju i opciono invalidira token na strani servera.</w:t>
       </w:r>
     </w:p>
     <w:p>
@@ -9480,7 +9511,21 @@
           <w:sz w:val="20"/>
           <w:szCs w:val="20"/>
         </w:rPr>
-        <w:t xml:space="preserve"> – Omogućava automatsko produžavanje sesije; na zahtev React klijenta izdaje novi JWT token bez potrebe za ponovnim logovanjem korisnika</w:t>
+        <w:t xml:space="preserve"> </w:t>
+      </w:r>
+      <w:r>
+        <w:rPr>
+          <w:sz w:val="20"/>
+          <w:szCs w:val="20"/>
+        </w:rPr>
+        <w:t>-</w:t>
+      </w:r>
+      <w:r>
+        <w:rPr>
+          <w:sz w:val="20"/>
+          <w:szCs w:val="20"/>
+        </w:rPr>
+        <w:t xml:space="preserve"> Omogućava automatsko produžavanje sesije; na zahtev React klijenta izdaje novi JWT token bez potrebe za ponovnim logovanjem korisnika</w:t>
       </w:r>
     </w:p>
     <w:p>
@@ -9491,16 +9536,8 @@
           <w:ilvl w:val="0"/>
           <w:numId w:val="40"/>
         </w:numPr>
-        <w:rPr>
-          <w:b/>
-          <w:bCs/>
-        </w:rPr>
-      </w:pPr>
-      <w:r>
-        <w:rPr>
-          <w:b/>
-          <w:bCs/>
-        </w:rPr>
+      </w:pPr>
+      <w:r>
         <w:t>AdminController</w:t>
       </w:r>
     </w:p>
@@ -9519,10 +9556,6 @@
         <w:ind w:left="720"/>
       </w:pPr>
       <w:r>
-        <w:rPr>
-          <w:b/>
-          <w:bCs/>
-        </w:rPr>
         <w:t>Metode:</w:t>
       </w:r>
     </w:p>
@@ -9610,16 +9643,8 @@
           <w:ilvl w:val="0"/>
           <w:numId w:val="40"/>
         </w:numPr>
-        <w:rPr>
-          <w:b/>
-          <w:bCs/>
-        </w:rPr>
-      </w:pPr>
-      <w:r>
-        <w:rPr>
-          <w:b/>
-          <w:bCs/>
-        </w:rPr>
+      </w:pPr>
+      <w:r>
         <w:t>LeagueController</w:t>
       </w:r>
     </w:p>
@@ -9638,10 +9663,6 @@
         <w:ind w:left="720"/>
       </w:pPr>
       <w:r>
-        <w:rPr>
-          <w:b/>
-          <w:bCs/>
-        </w:rPr>
         <w:t>Metode:</w:t>
       </w:r>
     </w:p>
@@ -9779,16 +9800,8 @@
           <w:ilvl w:val="0"/>
           <w:numId w:val="40"/>
         </w:numPr>
-        <w:rPr>
-          <w:b/>
-          <w:bCs/>
-        </w:rPr>
-      </w:pPr>
-      <w:r>
-        <w:rPr>
-          <w:b/>
-          <w:bCs/>
-        </w:rPr>
+      </w:pPr>
+      <w:r>
         <w:t>TeamController</w:t>
       </w:r>
     </w:p>
@@ -9807,10 +9820,6 @@
         <w:ind w:left="720"/>
       </w:pPr>
       <w:r>
-        <w:rPr>
-          <w:b/>
-          <w:bCs/>
-        </w:rPr>
         <w:t>Metode:</w:t>
       </w:r>
     </w:p>
@@ -9920,16 +9929,8 @@
           <w:ilvl w:val="0"/>
           <w:numId w:val="40"/>
         </w:numPr>
-        <w:rPr>
-          <w:b/>
-          <w:bCs/>
-        </w:rPr>
-      </w:pPr>
-      <w:r>
-        <w:rPr>
-          <w:b/>
-          <w:bCs/>
-        </w:rPr>
+      </w:pPr>
+      <w:r>
         <w:t>InviteController</w:t>
       </w:r>
     </w:p>
@@ -9948,10 +9949,6 @@
         <w:ind w:left="720"/>
       </w:pPr>
       <w:r>
-        <w:rPr>
-          <w:b/>
-          <w:bCs/>
-        </w:rPr>
         <w:t>Metode:</w:t>
       </w:r>
     </w:p>
@@ -10047,16 +10044,8 @@
           <w:ilvl w:val="0"/>
           <w:numId w:val="40"/>
         </w:numPr>
-        <w:rPr>
-          <w:b/>
-          <w:bCs/>
-        </w:rPr>
-      </w:pPr>
-      <w:r>
-        <w:rPr>
-          <w:b/>
-          <w:bCs/>
-        </w:rPr>
+      </w:pPr>
+      <w:r>
         <w:t>MatchController</w:t>
       </w:r>
     </w:p>
@@ -10075,10 +10064,6 @@
         <w:ind w:left="720"/>
       </w:pPr>
       <w:r>
-        <w:rPr>
-          <w:b/>
-          <w:bCs/>
-        </w:rPr>
         <w:t>Metode:</w:t>
       </w:r>
     </w:p>
@@ -10175,16 +10160,8 @@
           <w:ilvl w:val="0"/>
           <w:numId w:val="40"/>
         </w:numPr>
-        <w:rPr>
-          <w:b/>
-          <w:bCs/>
-        </w:rPr>
-      </w:pPr>
-      <w:r>
-        <w:rPr>
-          <w:b/>
-          <w:bCs/>
-        </w:rPr>
+      </w:pPr>
+      <w:r>
         <w:t>StatisticsController</w:t>
       </w:r>
     </w:p>
@@ -10203,10 +10180,6 @@
         <w:ind w:left="720"/>
       </w:pPr>
       <w:r>
-        <w:rPr>
-          <w:b/>
-          <w:bCs/>
-        </w:rPr>
         <w:t>Metode:</w:t>
       </w:r>
     </w:p>
@@ -10274,16 +10247,8 @@
           <w:ilvl w:val="0"/>
           <w:numId w:val="40"/>
         </w:numPr>
-        <w:rPr>
-          <w:b/>
-          <w:bCs/>
-        </w:rPr>
-      </w:pPr>
-      <w:r>
-        <w:rPr>
-          <w:b/>
-          <w:bCs/>
-        </w:rPr>
+      </w:pPr>
+      <w:r>
         <w:t>UserController</w:t>
       </w:r>
     </w:p>
@@ -10302,10 +10267,6 @@
         <w:ind w:left="720"/>
       </w:pPr>
       <w:r>
-        <w:rPr>
-          <w:b/>
-          <w:bCs/>
-        </w:rPr>
         <w:t>Metode:</w:t>
       </w:r>
     </w:p>
@@ -10512,14 +10473,13 @@
         </w:numPr>
       </w:pPr>
       <w:r>
-        <w:rPr>
-          <w:b/>
-          <w:bCs/>
-        </w:rPr>
-        <w:t>Users (DbSet&lt;User&gt;)</w:t>
-      </w:r>
-      <w:r>
-        <w:t xml:space="preserve"> – Tabela koja čuva podatke o svim registrovanim korisnicima na sistemu, njihovim kredencijalima, email adresama i globalnim sistemskim ulogama (Admin, Organizator, Sudija, Zapisničar, Igrač).</w:t>
+        <w:t xml:space="preserve">Users (DbSet&lt;User&gt;) </w:t>
+      </w:r>
+      <w:r>
+        <w:t>-</w:t>
+      </w:r>
+      <w:r>
+        <w:t xml:space="preserve"> Tabela koja čuva podatke o svim registrovanim korisnicima na sistemu, njihovim kredencijalima, email adresama i globalnim sistemskim ulogama (Admin, Organizator, Sudija, Zapisničar, Igrač).</w:t>
       </w:r>
     </w:p>
     <w:p>
@@ -10532,15 +10492,14 @@
         </w:numPr>
       </w:pPr>
       <w:r>
-        <w:rPr>
-          <w:b/>
-          <w:bCs/>
-        </w:rPr>
         <w:lastRenderedPageBreak/>
-        <w:t>Leagues (DbSet&lt;League&gt;)</w:t>
-      </w:r>
-      <w:r>
-        <w:t xml:space="preserve"> – Sadrži podatke o kreiranim ligama i turnirima, uključujući format takmičenja (3x3 ili 5x5), pravila i definisane maksimalne brojeve ekipa.</w:t>
+        <w:t xml:space="preserve">Leagues (DbSet&lt;League&gt;) </w:t>
+      </w:r>
+      <w:r>
+        <w:t>-</w:t>
+      </w:r>
+      <w:r>
+        <w:t xml:space="preserve"> Sadrži podatke o kreiranim ligama i turnirima, uključujući format takmičenja (3x3 ili 5x5), pravila i definisane maksimalne brojeve ekipa.</w:t>
       </w:r>
     </w:p>
     <w:p>
@@ -10553,14 +10512,13 @@
         </w:numPr>
       </w:pPr>
       <w:r>
-        <w:rPr>
-          <w:b/>
-          <w:bCs/>
-        </w:rPr>
-        <w:t>Teams (DbSet&lt;Team&gt;)</w:t>
-      </w:r>
-      <w:r>
-        <w:t xml:space="preserve"> – Kolekcija koja perzistira profile košarkaških timova, njihove gradove iz kojih dolaze i logotipe.</w:t>
+        <w:t xml:space="preserve">Teams (DbSet&lt;Team&gt;) </w:t>
+      </w:r>
+      <w:r>
+        <w:t>-</w:t>
+      </w:r>
+      <w:r>
+        <w:t xml:space="preserve"> Kolekcija koja perzistira profile košarkaških timova, njihove gradove iz kojih dolaze i logotipe.</w:t>
       </w:r>
     </w:p>
     <w:p>
@@ -10573,14 +10531,13 @@
         </w:numPr>
       </w:pPr>
       <w:r>
-        <w:rPr>
-          <w:b/>
-          <w:bCs/>
-        </w:rPr>
-        <w:t>TeamMembers (DbSet&lt;TeamMember&gt;)</w:t>
-      </w:r>
-      <w:r>
-        <w:t xml:space="preserve"> – Asocijativna tabela koja mapira zvanične rostere ekipa, povezujući korisnike sa konkretnim timovima i definišući njihovu ulogu unutar tima (npr. Kapiten ili Igrač).</w:t>
+        <w:t xml:space="preserve">TeamMembers (DbSet&lt;TeamMember&gt;) </w:t>
+      </w:r>
+      <w:r>
+        <w:t>-</w:t>
+      </w:r>
+      <w:r>
+        <w:t xml:space="preserve"> Asocijativna tabela koja mapira zvanične rostere ekipa, povezujući korisnike sa konkretnim timovima i definišući njihovu ulogu unutar tima (npr. Kapiten ili Igrač).</w:t>
       </w:r>
     </w:p>
     <w:p>
@@ -10593,14 +10550,13 @@
         </w:numPr>
       </w:pPr>
       <w:r>
-        <w:rPr>
-          <w:b/>
-          <w:bCs/>
-        </w:rPr>
-        <w:t>TeamInvites (DbSet&lt;TeamInvite&gt;)</w:t>
-      </w:r>
-      <w:r>
-        <w:t xml:space="preserve"> – Tabela zadužena za workflow regrutacije; pamti sve poslate pozivnice od strane kapitena ka igračima, kao i njihove statuse (na čekanju, prihvaćeno, odbijeno).</w:t>
+        <w:t xml:space="preserve">TeamInvites (DbSet&lt;TeamInvite&gt;) </w:t>
+      </w:r>
+      <w:r>
+        <w:t>-</w:t>
+      </w:r>
+      <w:r>
+        <w:t xml:space="preserve"> Tabela zadužena za workflow regrutacije; pamti sve poslate pozivnice od strane kapitena ka igračima, kao i njihove statuse (na čekanju, prihvaćeno, odbijeno).</w:t>
       </w:r>
     </w:p>
     <w:p>
@@ -10613,14 +10569,13 @@
         </w:numPr>
       </w:pPr>
       <w:r>
-        <w:rPr>
-          <w:b/>
-          <w:bCs/>
-        </w:rPr>
-        <w:t>Matches (DbSet&lt;Match&gt;)</w:t>
-      </w:r>
-      <w:r>
-        <w:t xml:space="preserve"> – Sadrži rasporede utakmica, termine, lokacije terena, trenutne rezultate i statuse mečeva uživo (zakazano, u toku, završeno).</w:t>
+        <w:t xml:space="preserve">Matches (DbSet&lt;Match&gt;) </w:t>
+      </w:r>
+      <w:r>
+        <w:t>-</w:t>
+      </w:r>
+      <w:r>
+        <w:t xml:space="preserve"> Sadrži rasporede utakmica, termine, lokacije terena, trenutne rezultate i statuse mečeva uživo (zakazano, u toku, završeno).</w:t>
       </w:r>
     </w:p>
     <w:p>
@@ -10633,14 +10588,16 @@
         </w:numPr>
       </w:pPr>
       <w:r>
-        <w:rPr>
-          <w:b/>
-          <w:bCs/>
-        </w:rPr>
-        <w:t>UserMatchStats (DbSet&lt;UserMatchStats&gt;)</w:t>
-      </w:r>
-      <w:r>
-        <w:t xml:space="preserve"> – Tabela koja skladišti detaljnu i sveobuhvatnu individualnu statistiku (poene, faulove, asistencije, skokove) za svakog igrača sa svakog pojedinačnog meča, omogućavajući naprednu analitiku.</w:t>
+        <w:t xml:space="preserve">UserMatchStats (DbSet&lt;UserMatchStats&gt;) </w:t>
+      </w:r>
+      <w:r>
+        <w:t>-</w:t>
+      </w:r>
+      <w:r>
+        <w:t xml:space="preserve"> Tabela koja skladišti detaljnu i sveobuhvatnu individualnu statistiku (poene, faulove, asistencije, skokove) za svakog igrača sa svakog pojedinačnog meča, omogućavajući naprednu analitiku</w:t>
+      </w:r>
+      <w:r>
+        <w:t>.</w:t>
       </w:r>
     </w:p>
     <w:p>
@@ -11133,7 +11090,10 @@
             <w:ind w:right="68"/>
           </w:pPr>
           <w:r>
-            <w:t xml:space="preserve">  Verzija:           1.0</w:t>
+            <w:t xml:space="preserve">  </w:t>
+          </w:r>
+          <w:r>
+            <w:t>Verzija:           1.0</w:t>
           </w:r>
         </w:p>
       </w:tc>
@@ -16360,7 +16320,6 @@
   <w:style w:type="character" w:default="1" w:styleId="DefaultParagraphFont">
     <w:name w:val="Default Paragraph Font"/>
     <w:uiPriority w:val="1"/>
-    <w:semiHidden/>
     <w:unhideWhenUsed/>
   </w:style>
   <w:style w:type="table" w:default="1" w:styleId="TableNormal">

</xml_diff>